<commit_message>
Cập nhật tính năng flash sale, quản lý đơn hàng và giao diện người dùng
</commit_message>
<xml_diff>
--- a/word-slide-poster/VY_ĐỒ_ÁN.docx
+++ b/word-slide-poster/VY_ĐỒ_ÁN.docx
@@ -1609,6 +1609,8 @@
           <w:szCs w:val="26"/>
         </w:rPr>
       </w:pPr>
+      <w:bookmarkStart w:id="181" w:name="_GoBack"/>
+      <w:bookmarkEnd w:id="181"/>
       <w:r>
         <w:rPr>
           <w:rFonts w:ascii="Times New Roman" w:hAnsi="Times New Roman" w:cs="Times New Roman"/>
@@ -2029,7 +2031,9 @@
                                 </w:tabs>
                                 <w:jc w:val="center"/>
                                 <w:rPr>
+                                  <w:rFonts w:hint="default"/>
                                   <w:b/>
+                                  <w:lang w:val="en-US"/>
                                 </w:rPr>
                               </w:pPr>
                               <w:r>
@@ -2042,7 +2046,22 @@
                                 <w:rPr>
                                   <w:b/>
                                 </w:rPr>
-                                <w:t>Giáo viên hướng dẫn</w:t>
+                                <w:t>Giáo viên h</w:t>
+                              </w:r>
+                              <w:r>
+                                <w:rPr>
+                                  <w:b/>
+                                  <w:lang w:val="en-US"/>
+                                </w:rPr>
+                                <w:t>ộ</w:t>
+                              </w:r>
+                              <w:r>
+                                <w:rPr>
+                                  <w:rFonts w:hint="default"/>
+                                  <w:b/>
+                                  <w:lang w:val="en-US"/>
+                                </w:rPr>
+                                <w:t>i đồng</w:t>
                               </w:r>
                             </w:p>
                             <w:p>
@@ -2650,7 +2669,9 @@
                           </w:tabs>
                           <w:jc w:val="center"/>
                           <w:rPr>
+                            <w:rFonts w:hint="default"/>
                             <w:b/>
+                            <w:lang w:val="en-US"/>
                           </w:rPr>
                         </w:pPr>
                         <w:r>
@@ -2663,7 +2684,22 @@
                           <w:rPr>
                             <w:b/>
                           </w:rPr>
-                          <w:t>Giáo viên hướng dẫn</w:t>
+                          <w:t>Giáo viên h</w:t>
+                        </w:r>
+                        <w:r>
+                          <w:rPr>
+                            <w:b/>
+                            <w:lang w:val="en-US"/>
+                          </w:rPr>
+                          <w:t>ộ</w:t>
+                        </w:r>
+                        <w:r>
+                          <w:rPr>
+                            <w:rFonts w:hint="default"/>
+                            <w:b/>
+                            <w:lang w:val="en-US"/>
+                          </w:rPr>
+                          <w:t>i đồng</w:t>
                         </w:r>
                       </w:p>
                       <w:p>
@@ -3241,10 +3277,10 @@
           <w:szCs w:val="26"/>
         </w:rPr>
       </w:pPr>
-      <w:bookmarkStart w:id="4" w:name="_Toc13697"/>
-      <w:bookmarkStart w:id="5" w:name="_Toc27274"/>
-      <w:bookmarkStart w:id="6" w:name="_Toc25019"/>
-      <w:bookmarkStart w:id="7" w:name="_Toc31889"/>
+      <w:bookmarkStart w:id="4" w:name="_Toc25019"/>
+      <w:bookmarkStart w:id="5" w:name="_Toc31889"/>
+      <w:bookmarkStart w:id="6" w:name="_Toc27274"/>
+      <w:bookmarkStart w:id="7" w:name="_Toc13697"/>
       <w:r>
         <w:rPr>
           <w:rFonts w:ascii="Times New Roman" w:hAnsi="Times New Roman" w:cs="Times New Roman"/>
@@ -8189,9 +8225,9 @@
       <w:bookmarkStart w:id="11" w:name="_Toc24335"/>
       <w:bookmarkStart w:id="12" w:name="_Toc14681"/>
       <w:bookmarkStart w:id="13" w:name="_Toc21885"/>
-      <w:bookmarkStart w:id="14" w:name="_Toc155038921"/>
-      <w:bookmarkStart w:id="15" w:name="_Toc1419809179"/>
-      <w:bookmarkStart w:id="16" w:name="_Toc2064234370"/>
+      <w:bookmarkStart w:id="14" w:name="_Toc1419809179"/>
+      <w:bookmarkStart w:id="15" w:name="_Toc2064234370"/>
+      <w:bookmarkStart w:id="16" w:name="_Toc155038921"/>
       <w:r>
         <w:rPr>
           <w:rStyle w:val="33"/>
@@ -8330,8 +8366,8 @@
           <w:sz w:val="26"/>
         </w:rPr>
       </w:pPr>
-      <w:bookmarkStart w:id="19" w:name="_Toc2832"/>
-      <w:bookmarkStart w:id="20" w:name="_Toc30786"/>
+      <w:bookmarkStart w:id="19" w:name="_Toc30786"/>
+      <w:bookmarkStart w:id="20" w:name="_Toc2832"/>
       <w:bookmarkStart w:id="21" w:name="_Toc29287"/>
       <w:r>
         <w:rPr>
@@ -8479,8 +8515,8 @@
           <w:sz w:val="26"/>
         </w:rPr>
       </w:pPr>
-      <w:bookmarkStart w:id="26" w:name="_Toc30139"/>
-      <w:bookmarkStart w:id="27" w:name="_Toc15627"/>
+      <w:bookmarkStart w:id="26" w:name="_Toc15627"/>
+      <w:bookmarkStart w:id="27" w:name="_Toc30139"/>
       <w:r>
         <w:rPr>
           <w:rFonts w:ascii="Times New Roman" w:hAnsi="Times New Roman" w:cs="Times New Roman"/>
@@ -8793,8 +8829,8 @@
         </w:rPr>
       </w:pPr>
       <w:bookmarkStart w:id="31" w:name="_Toc6648"/>
-      <w:bookmarkStart w:id="32" w:name="_Toc27107"/>
-      <w:bookmarkStart w:id="33" w:name="_Toc29613"/>
+      <w:bookmarkStart w:id="32" w:name="_Toc29613"/>
+      <w:bookmarkStart w:id="33" w:name="_Toc27107"/>
       <w:r>
         <w:rPr>
           <w:rFonts w:ascii="Times New Roman" w:hAnsi="Times New Roman" w:cs="Times New Roman"/>
@@ -8890,8 +8926,8 @@
           <w:szCs w:val="26"/>
         </w:rPr>
       </w:pPr>
-      <w:bookmarkStart w:id="34" w:name="_Toc22281"/>
-      <w:bookmarkStart w:id="35" w:name="_Toc28667"/>
+      <w:bookmarkStart w:id="34" w:name="_Toc28667"/>
+      <w:bookmarkStart w:id="35" w:name="_Toc22281"/>
       <w:r>
         <w:rPr>
           <w:rFonts w:ascii="Times New Roman" w:hAnsi="Times New Roman" w:cs="Times New Roman"/>
@@ -9027,9 +9063,9 @@
           <w:szCs w:val="26"/>
         </w:rPr>
       </w:pPr>
-      <w:bookmarkStart w:id="36" w:name="_Toc21932"/>
-      <w:bookmarkStart w:id="37" w:name="_Toc13508"/>
-      <w:bookmarkStart w:id="38" w:name="_Toc14590"/>
+      <w:bookmarkStart w:id="36" w:name="_Toc13508"/>
+      <w:bookmarkStart w:id="37" w:name="_Toc14590"/>
+      <w:bookmarkStart w:id="38" w:name="_Toc21932"/>
       <w:r>
         <w:rPr>
           <w:rFonts w:ascii="Times New Roman" w:hAnsi="Times New Roman" w:cs="Times New Roman"/>
@@ -9051,9 +9087,9 @@
           <w:sz w:val="26"/>
         </w:rPr>
       </w:pPr>
-      <w:bookmarkStart w:id="39" w:name="_Toc16913"/>
-      <w:bookmarkStart w:id="40" w:name="_Toc18048"/>
-      <w:bookmarkStart w:id="41" w:name="_Toc11012"/>
+      <w:bookmarkStart w:id="39" w:name="_Toc11012"/>
+      <w:bookmarkStart w:id="40" w:name="_Toc16913"/>
+      <w:bookmarkStart w:id="41" w:name="_Toc18048"/>
       <w:r>
         <w:rPr>
           <w:rFonts w:ascii="Times New Roman" w:hAnsi="Times New Roman" w:cs="Times New Roman"/>
@@ -9598,9 +9634,9 @@
           <w:lang w:eastAsia="zh-CN"/>
         </w:rPr>
       </w:pPr>
-      <w:bookmarkStart w:id="46" w:name="_Toc4341"/>
+      <w:bookmarkStart w:id="46" w:name="_Toc10538"/>
       <w:bookmarkStart w:id="47" w:name="_Toc13068"/>
-      <w:bookmarkStart w:id="48" w:name="_Toc10538"/>
+      <w:bookmarkStart w:id="48" w:name="_Toc4341"/>
       <w:r>
         <w:rPr>
           <w:rFonts w:ascii="Times New Roman" w:hAnsi="Times New Roman" w:cs="Times New Roman"/>
@@ -9624,8 +9660,8 @@
           <w:lang w:eastAsia="zh-CN"/>
         </w:rPr>
       </w:pPr>
-      <w:bookmarkStart w:id="49" w:name="_Toc28377"/>
-      <w:bookmarkStart w:id="50" w:name="_Toc8920"/>
+      <w:bookmarkStart w:id="49" w:name="_Toc8920"/>
+      <w:bookmarkStart w:id="50" w:name="_Toc28377"/>
       <w:r>
         <w:rPr>
           <w:rFonts w:ascii="Times New Roman" w:hAnsi="Times New Roman" w:cs="Times New Roman"/>
@@ -10174,9 +10210,9 @@
           <w:lang w:eastAsia="zh-CN"/>
         </w:rPr>
       </w:pPr>
-      <w:bookmarkStart w:id="53" w:name="_Toc9706"/>
+      <w:bookmarkStart w:id="53" w:name="_Toc394"/>
       <w:bookmarkStart w:id="54" w:name="_Toc7027"/>
-      <w:bookmarkStart w:id="55" w:name="_Toc394"/>
+      <w:bookmarkStart w:id="55" w:name="_Toc9706"/>
       <w:r>
         <w:rPr>
           <w:rFonts w:ascii="Times New Roman" w:hAnsi="Times New Roman" w:cs="Times New Roman"/>
@@ -10337,11 +10373,11 @@
           <w:szCs w:val="26"/>
         </w:rPr>
       </w:pPr>
-      <w:bookmarkStart w:id="58" w:name="_Toc21468"/>
-      <w:bookmarkStart w:id="59" w:name="_Toc1871"/>
-      <w:bookmarkStart w:id="60" w:name="_Toc25874"/>
-      <w:bookmarkStart w:id="61" w:name="_Toc27508"/>
-      <w:bookmarkStart w:id="62" w:name="_Toc1466"/>
+      <w:bookmarkStart w:id="58" w:name="_Toc25874"/>
+      <w:bookmarkStart w:id="59" w:name="_Toc1466"/>
+      <w:bookmarkStart w:id="60" w:name="_Toc27508"/>
+      <w:bookmarkStart w:id="61" w:name="_Toc1871"/>
+      <w:bookmarkStart w:id="62" w:name="_Toc21468"/>
       <w:r>
         <w:rPr>
           <w:rFonts w:ascii="Times New Roman" w:hAnsi="Times New Roman" w:cs="Times New Roman"/>
@@ -10701,8 +10737,8 @@
         </w:rPr>
       </w:pPr>
       <w:bookmarkStart w:id="63" w:name="_Toc30004"/>
-      <w:bookmarkStart w:id="64" w:name="_Toc1348"/>
-      <w:bookmarkStart w:id="65" w:name="_Toc32680"/>
+      <w:bookmarkStart w:id="64" w:name="_Toc32680"/>
+      <w:bookmarkStart w:id="65" w:name="_Toc1348"/>
       <w:r>
         <w:rPr>
           <w:rFonts w:ascii="Times New Roman" w:hAnsi="Times New Roman" w:cs="Times New Roman"/>
@@ -10724,8 +10760,8 @@
           <w:szCs w:val="26"/>
         </w:rPr>
       </w:pPr>
-      <w:bookmarkStart w:id="66" w:name="_Toc16075"/>
-      <w:bookmarkStart w:id="67" w:name="_Toc5228"/>
+      <w:bookmarkStart w:id="66" w:name="_Toc5228"/>
+      <w:bookmarkStart w:id="67" w:name="_Toc16075"/>
       <w:r>
         <w:rPr>
           <w:rFonts w:ascii="Times New Roman" w:hAnsi="Times New Roman" w:cs="Times New Roman"/>
@@ -12942,8 +12978,8 @@
           <w:sz w:val="26"/>
         </w:rPr>
       </w:pPr>
-      <w:bookmarkStart w:id="83" w:name="_Toc3650"/>
-      <w:bookmarkStart w:id="84" w:name="_Toc14891"/>
+      <w:bookmarkStart w:id="83" w:name="_Toc14891"/>
+      <w:bookmarkStart w:id="84" w:name="_Toc3650"/>
       <w:r>
         <w:rPr>
           <w:rFonts w:ascii="Times New Roman" w:hAnsi="Times New Roman" w:cs="Times New Roman"/>
@@ -13143,8 +13179,8 @@
         </w:rPr>
       </w:pPr>
       <w:bookmarkStart w:id="87" w:name="_Toc15726"/>
-      <w:bookmarkStart w:id="88" w:name="_Toc14014"/>
-      <w:bookmarkStart w:id="89" w:name="_Toc25802"/>
+      <w:bookmarkStart w:id="88" w:name="_Toc25802"/>
+      <w:bookmarkStart w:id="89" w:name="_Toc14014"/>
       <w:r>
         <w:rPr>
           <w:rFonts w:ascii="Times New Roman" w:hAnsi="Times New Roman" w:cs="Times New Roman"/>
@@ -13742,9 +13778,9 @@
           <w:sz w:val="26"/>
         </w:rPr>
       </w:pPr>
-      <w:bookmarkStart w:id="99" w:name="_Toc6030"/>
-      <w:bookmarkStart w:id="100" w:name="_Toc9710"/>
-      <w:bookmarkStart w:id="101" w:name="_Toc29773"/>
+      <w:bookmarkStart w:id="99" w:name="_Toc29773"/>
+      <w:bookmarkStart w:id="100" w:name="_Toc6030"/>
+      <w:bookmarkStart w:id="101" w:name="_Toc9710"/>
       <w:r>
         <w:rPr>
           <w:rFonts w:ascii="Times New Roman" w:hAnsi="Times New Roman" w:cs="Times New Roman"/>
@@ -14174,9 +14210,9 @@
           <w:szCs w:val="26"/>
         </w:rPr>
       </w:pPr>
-      <w:bookmarkStart w:id="102" w:name="_Toc8729"/>
-      <w:bookmarkStart w:id="103" w:name="_Toc30274"/>
-      <w:bookmarkStart w:id="104" w:name="_Toc2883"/>
+      <w:bookmarkStart w:id="102" w:name="_Toc2883"/>
+      <w:bookmarkStart w:id="103" w:name="_Toc8729"/>
+      <w:bookmarkStart w:id="104" w:name="_Toc30274"/>
       <w:r>
         <w:rPr>
           <w:rFonts w:ascii="Times New Roman" w:hAnsi="Times New Roman" w:cs="Times New Roman"/>
@@ -15665,9 +15701,9 @@
           <w:szCs w:val="26"/>
         </w:rPr>
       </w:pPr>
-      <w:bookmarkStart w:id="130" w:name="_Toc26934"/>
-      <w:bookmarkStart w:id="131" w:name="_Toc28761"/>
-      <w:bookmarkStart w:id="132" w:name="_Toc13160"/>
+      <w:bookmarkStart w:id="130" w:name="_Toc28761"/>
+      <w:bookmarkStart w:id="131" w:name="_Toc13160"/>
+      <w:bookmarkStart w:id="132" w:name="_Toc26934"/>
       <w:r>
         <w:rPr>
           <w:rFonts w:ascii="Times New Roman" w:hAnsi="Times New Roman" w:cs="Times New Roman"/>
@@ -15876,8 +15912,8 @@
           <w:sz w:val="26"/>
         </w:rPr>
       </w:pPr>
-      <w:bookmarkStart w:id="137" w:name="_Toc19997"/>
-      <w:bookmarkStart w:id="138" w:name="_Toc28389"/>
+      <w:bookmarkStart w:id="137" w:name="_Toc28389"/>
+      <w:bookmarkStart w:id="138" w:name="_Toc19997"/>
       <w:r>
         <w:rPr>
           <w:rFonts w:ascii="Times New Roman" w:hAnsi="Times New Roman" w:cs="Times New Roman"/>
@@ -16266,8 +16302,8 @@
           <w:sz w:val="26"/>
         </w:rPr>
       </w:pPr>
-      <w:bookmarkStart w:id="144" w:name="_Toc18868"/>
-      <w:bookmarkStart w:id="145" w:name="_Toc10178"/>
+      <w:bookmarkStart w:id="144" w:name="_Toc10178"/>
+      <w:bookmarkStart w:id="145" w:name="_Toc18868"/>
       <w:r>
         <w:rPr>
           <w:rFonts w:ascii="Times New Roman" w:hAnsi="Times New Roman" w:cs="Times New Roman"/>
@@ -16408,8 +16444,6 @@
         </w:rPr>
         <w:t>Hiển thị thông tin chung về cửa hàng, giá trị cốt lõi mà cửa hàng nước hoa Orianna đem lại, lý do khách hàng có thể an tâm khi sử dụng dịch vụ mua sắm tại cửa hàng.</w:t>
       </w:r>
-      <w:bookmarkStart w:id="181" w:name="_GoBack"/>
-      <w:bookmarkEnd w:id="181"/>
     </w:p>
     <w:p>
       <w:pPr>
@@ -16419,8 +16453,8 @@
           <w:sz w:val="26"/>
         </w:rPr>
       </w:pPr>
-      <w:bookmarkStart w:id="147" w:name="_Toc12445"/>
-      <w:bookmarkStart w:id="148" w:name="_Toc20121"/>
+      <w:bookmarkStart w:id="147" w:name="_Toc20121"/>
+      <w:bookmarkStart w:id="148" w:name="_Toc12445"/>
       <w:r>
         <w:rPr>
           <w:rFonts w:ascii="Times New Roman" w:hAnsi="Times New Roman" w:cs="Times New Roman"/>
@@ -16744,8 +16778,8 @@
           <w:sz w:val="26"/>
         </w:rPr>
       </w:pPr>
-      <w:bookmarkStart w:id="156" w:name="_Toc25941"/>
-      <w:bookmarkStart w:id="157" w:name="_Toc15139"/>
+      <w:bookmarkStart w:id="156" w:name="_Toc15139"/>
+      <w:bookmarkStart w:id="157" w:name="_Toc25941"/>
       <w:r>
         <w:rPr>
           <w:rFonts w:ascii="Times New Roman" w:hAnsi="Times New Roman" w:cs="Times New Roman"/>
@@ -17648,7 +17682,7 @@
       <w:sdtPr>
         <w:id w:val="911897603"/>
         <w:docPartObj>
-          <w:docPartGallery w:val="AutoText"/>
+          <w:docPartGallery w:val="autotext"/>
         </w:docPartObj>
       </w:sdtPr>
       <w:sdtEndPr>

</xml_diff>